<commit_message>
deleted inflation, added doc strings
</commit_message>
<xml_diff>
--- a/doc/TODO.docx
+++ b/doc/TODO.docx
@@ -2237,9 +2237,13 @@
         <w:rPr>
           <w:rFonts w:ascii="JetBrains Mono" w:hAnsi="JetBrains Mono"/>
           <w:color w:val="080808"/>
-        </w:rPr>
-      </w:pPr>
-      <w:r>
+          <w:lang w:val="ru-RU"/>
+        </w:rPr>
+      </w:pPr>
+      <w:r>
+        <w:rPr>
+          <w:lang w:val="ru-RU"/>
+        </w:rPr>
         <w:t xml:space="preserve">15. </w:t>
       </w:r>
       <w:proofErr w:type="spellStart"/>
@@ -2257,8 +2261,43 @@
           <w:rFonts w:ascii="JetBrains Mono" w:hAnsi="JetBrains Mono"/>
           <w:color w:val="080808"/>
           <w:highlight w:val="green"/>
-        </w:rPr>
-        <w:t xml:space="preserve"> require low </w:t>
+          <w:lang w:val="ru-RU"/>
+        </w:rPr>
+        <w:t xml:space="preserve"> </w:t>
+      </w:r>
+      <w:r>
+        <w:rPr>
+          <w:rFonts w:ascii="JetBrains Mono" w:hAnsi="JetBrains Mono"/>
+          <w:color w:val="080808"/>
+          <w:highlight w:val="green"/>
+        </w:rPr>
+        <w:t>require</w:t>
+      </w:r>
+      <w:r>
+        <w:rPr>
+          <w:rFonts w:ascii="JetBrains Mono" w:hAnsi="JetBrains Mono"/>
+          <w:color w:val="080808"/>
+          <w:highlight w:val="green"/>
+          <w:lang w:val="ru-RU"/>
+        </w:rPr>
+        <w:t xml:space="preserve"> </w:t>
+      </w:r>
+      <w:r>
+        <w:rPr>
+          <w:rFonts w:ascii="JetBrains Mono" w:hAnsi="JetBrains Mono"/>
+          <w:color w:val="080808"/>
+          <w:highlight w:val="green"/>
+        </w:rPr>
+        <w:t>low</w:t>
+      </w:r>
+      <w:r>
+        <w:rPr>
+          <w:rFonts w:ascii="JetBrains Mono" w:hAnsi="JetBrains Mono"/>
+          <w:color w:val="080808"/>
+          <w:highlight w:val="green"/>
+          <w:lang w:val="ru-RU"/>
+        </w:rPr>
+        <w:t xml:space="preserve"> </w:t>
       </w:r>
       <w:proofErr w:type="spellStart"/>
       <w:r>
@@ -5224,6 +5263,178 @@
         </w:rPr>
       </w:pPr>
     </w:p>
+    <w:p>
+      <w:pPr>
+        <w:rPr>
+          <w:b/>
+          <w:sz w:val="40"/>
+          <w:szCs w:val="56"/>
+          <w:lang w:val="ru-RU"/>
+        </w:rPr>
+      </w:pPr>
+      <w:r>
+        <w:rPr>
+          <w:b/>
+          <w:sz w:val="40"/>
+          <w:szCs w:val="56"/>
+          <w:lang w:val="ru-RU"/>
+        </w:rPr>
+        <w:t xml:space="preserve">2024 </w:t>
+      </w:r>
+    </w:p>
+    <w:p>
+      <w:pPr>
+        <w:pStyle w:val="a3"/>
+        <w:numPr>
+          <w:ilvl w:val="0"/>
+          <w:numId w:val="12"/>
+        </w:numPr>
+        <w:rPr>
+          <w:b/>
+          <w:sz w:val="40"/>
+          <w:szCs w:val="56"/>
+        </w:rPr>
+      </w:pPr>
+      <w:r>
+        <w:rPr>
+          <w:b/>
+          <w:sz w:val="40"/>
+          <w:szCs w:val="56"/>
+        </w:rPr>
+        <w:t xml:space="preserve">Balance Bot </w:t>
+      </w:r>
+    </w:p>
+    <w:p>
+      <w:pPr>
+        <w:pStyle w:val="a3"/>
+        <w:rPr>
+          <w:rFonts w:ascii="Arial" w:hAnsi="Arial" w:cs="Arial"/>
+          <w:color w:val="202122"/>
+          <w:sz w:val="21"/>
+          <w:szCs w:val="21"/>
+          <w:shd w:val="clear" w:color="auto" w:fill="FFFFFF"/>
+          <w:lang w:val="ru-RU"/>
+        </w:rPr>
+      </w:pPr>
+      <w:r>
+        <w:rPr>
+          <w:rFonts w:ascii="Arial" w:hAnsi="Arial" w:cs="Arial"/>
+          <w:color w:val="202122"/>
+          <w:sz w:val="21"/>
+          <w:szCs w:val="21"/>
+          <w:shd w:val="clear" w:color="auto" w:fill="FFFFFF"/>
+          <w:lang w:val="ru-RU"/>
+        </w:rPr>
+        <w:t xml:space="preserve">Нужно написать робота, который будет балансировать стоимость в пуле. Он обладает определенной ликвидностью и раз в сутки либо сливает, либо подливает крипту в пул, чтобы не происходило дисбаланса. </w:t>
+      </w:r>
+    </w:p>
+    <w:p>
+      <w:pPr>
+        <w:pStyle w:val="a3"/>
+        <w:numPr>
+          <w:ilvl w:val="0"/>
+          <w:numId w:val="12"/>
+        </w:numPr>
+        <w:rPr>
+          <w:b/>
+          <w:sz w:val="40"/>
+          <w:szCs w:val="56"/>
+          <w:lang w:val="ru-RU"/>
+        </w:rPr>
+      </w:pPr>
+      <w:r>
+        <w:rPr>
+          <w:b/>
+          <w:sz w:val="40"/>
+          <w:szCs w:val="56"/>
+          <w:lang w:val="ru-RU"/>
+        </w:rPr>
+        <w:lastRenderedPageBreak/>
+        <w:t xml:space="preserve">Нужно придумать, как даже в централизованном варианте оракула предотвратить обнуление системы. </w:t>
+      </w:r>
+    </w:p>
+    <w:p>
+      <w:pPr>
+        <w:pStyle w:val="a3"/>
+        <w:rPr>
+          <w:rFonts w:ascii="Arial" w:hAnsi="Arial" w:cs="Arial"/>
+          <w:color w:val="202122"/>
+          <w:sz w:val="21"/>
+          <w:szCs w:val="21"/>
+          <w:shd w:val="clear" w:color="auto" w:fill="FFFFFF"/>
+          <w:lang w:val="ru-RU"/>
+        </w:rPr>
+      </w:pPr>
+      <w:r>
+        <w:rPr>
+          <w:rFonts w:ascii="Arial" w:hAnsi="Arial" w:cs="Arial"/>
+          <w:color w:val="202122"/>
+          <w:sz w:val="21"/>
+          <w:szCs w:val="21"/>
+          <w:shd w:val="clear" w:color="auto" w:fill="FFFFFF"/>
+          <w:lang w:val="ru-RU"/>
+        </w:rPr>
+        <w:t>(не раз</w:t>
+      </w:r>
+      <w:r>
+        <w:rPr>
+          <w:rFonts w:ascii="Arial" w:hAnsi="Arial" w:cs="Arial"/>
+          <w:color w:val="202122"/>
+          <w:sz w:val="21"/>
+          <w:szCs w:val="21"/>
+          <w:shd w:val="clear" w:color="auto" w:fill="FFFFFF"/>
+          <w:lang w:val="ru-RU"/>
+        </w:rPr>
+        <w:t xml:space="preserve">решать менять котировку более чем на 1% по сравнению с предыдущим значением, например). Нужно 10 оракулов, каждый из которых транслирует котировки, а потом выбирается среднее, исключив предварительно 2 наибольших и 2 наименьших. </w:t>
+      </w:r>
+    </w:p>
+    <w:p>
+      <w:pPr>
+        <w:pStyle w:val="a3"/>
+        <w:rPr>
+          <w:b/>
+          <w:sz w:val="40"/>
+          <w:szCs w:val="56"/>
+          <w:lang w:val="ru-RU"/>
+        </w:rPr>
+      </w:pPr>
+    </w:p>
+    <w:p>
+      <w:pPr>
+        <w:pStyle w:val="a3"/>
+        <w:numPr>
+          <w:ilvl w:val="0"/>
+          <w:numId w:val="12"/>
+        </w:numPr>
+        <w:rPr>
+          <w:b/>
+          <w:sz w:val="40"/>
+          <w:szCs w:val="56"/>
+          <w:lang w:val="ru-RU"/>
+        </w:rPr>
+      </w:pPr>
+      <w:proofErr w:type="spellStart"/>
+      <w:r>
+        <w:rPr>
+          <w:b/>
+          <w:sz w:val="40"/>
+          <w:szCs w:val="56"/>
+          <w:lang w:val="ru-RU"/>
+        </w:rPr>
+        <w:t>фыва</w:t>
+      </w:r>
+      <w:proofErr w:type="spellEnd"/>
+    </w:p>
+    <w:p>
+      <w:pPr>
+        <w:rPr>
+          <w:b/>
+          <w:sz w:val="40"/>
+          <w:szCs w:val="56"/>
+          <w:lang w:val="ru-RU"/>
+        </w:rPr>
+      </w:pPr>
+    </w:p>
     <w:sectPr>
       <w:pgSz w:w="12240" w:h="15840"/>
       <w:pgMar w:top="1134" w:right="850" w:bottom="1134" w:left="1701" w:header="720" w:footer="720" w:gutter="0"/>
@@ -5943,6 +6154,95 @@
     </w:lvl>
   </w:abstractNum>
   <w:abstractNum w:abstractNumId="8" w15:restartNumberingAfterBreak="0">
+    <w:nsid w:val="426A28BD"/>
+    <w:multiLevelType w:val="hybridMultilevel"/>
+    <w:tmpl w:val="87F09716"/>
+    <w:lvl w:ilvl="0" w:tplc="04090011">
+      <w:start w:val="1"/>
+      <w:numFmt w:val="decimal"/>
+      <w:lvlText w:val="%1)"/>
+      <w:lvlJc w:val="left"/>
+      <w:pPr>
+        <w:ind w:left="720" w:hanging="360"/>
+      </w:pPr>
+      <w:rPr>
+        <w:rFonts w:hint="default"/>
+      </w:rPr>
+    </w:lvl>
+    <w:lvl w:ilvl="1" w:tplc="04090019" w:tentative="1">
+      <w:start w:val="1"/>
+      <w:numFmt w:val="lowerLetter"/>
+      <w:lvlText w:val="%2."/>
+      <w:lvlJc w:val="left"/>
+      <w:pPr>
+        <w:ind w:left="1440" w:hanging="360"/>
+      </w:pPr>
+    </w:lvl>
+    <w:lvl w:ilvl="2" w:tplc="0409001B" w:tentative="1">
+      <w:start w:val="1"/>
+      <w:numFmt w:val="lowerRoman"/>
+      <w:lvlText w:val="%3."/>
+      <w:lvlJc w:val="right"/>
+      <w:pPr>
+        <w:ind w:left="2160" w:hanging="180"/>
+      </w:pPr>
+    </w:lvl>
+    <w:lvl w:ilvl="3" w:tplc="0409000F" w:tentative="1">
+      <w:start w:val="1"/>
+      <w:numFmt w:val="decimal"/>
+      <w:lvlText w:val="%4."/>
+      <w:lvlJc w:val="left"/>
+      <w:pPr>
+        <w:ind w:left="2880" w:hanging="360"/>
+      </w:pPr>
+    </w:lvl>
+    <w:lvl w:ilvl="4" w:tplc="04090019" w:tentative="1">
+      <w:start w:val="1"/>
+      <w:numFmt w:val="lowerLetter"/>
+      <w:lvlText w:val="%5."/>
+      <w:lvlJc w:val="left"/>
+      <w:pPr>
+        <w:ind w:left="3600" w:hanging="360"/>
+      </w:pPr>
+    </w:lvl>
+    <w:lvl w:ilvl="5" w:tplc="0409001B" w:tentative="1">
+      <w:start w:val="1"/>
+      <w:numFmt w:val="lowerRoman"/>
+      <w:lvlText w:val="%6."/>
+      <w:lvlJc w:val="right"/>
+      <w:pPr>
+        <w:ind w:left="4320" w:hanging="180"/>
+      </w:pPr>
+    </w:lvl>
+    <w:lvl w:ilvl="6" w:tplc="0409000F" w:tentative="1">
+      <w:start w:val="1"/>
+      <w:numFmt w:val="decimal"/>
+      <w:lvlText w:val="%7."/>
+      <w:lvlJc w:val="left"/>
+      <w:pPr>
+        <w:ind w:left="5040" w:hanging="360"/>
+      </w:pPr>
+    </w:lvl>
+    <w:lvl w:ilvl="7" w:tplc="04090019" w:tentative="1">
+      <w:start w:val="1"/>
+      <w:numFmt w:val="lowerLetter"/>
+      <w:lvlText w:val="%8."/>
+      <w:lvlJc w:val="left"/>
+      <w:pPr>
+        <w:ind w:left="5760" w:hanging="360"/>
+      </w:pPr>
+    </w:lvl>
+    <w:lvl w:ilvl="8" w:tplc="0409001B" w:tentative="1">
+      <w:start w:val="1"/>
+      <w:numFmt w:val="lowerRoman"/>
+      <w:lvlText w:val="%9."/>
+      <w:lvlJc w:val="right"/>
+      <w:pPr>
+        <w:ind w:left="6480" w:hanging="180"/>
+      </w:pPr>
+    </w:lvl>
+  </w:abstractNum>
+  <w:abstractNum w:abstractNumId="9" w15:restartNumberingAfterBreak="0">
     <w:nsid w:val="55DB72AC"/>
     <w:multiLevelType w:val="hybridMultilevel"/>
     <w:tmpl w:val="24424B74"/>
@@ -6031,7 +6331,7 @@
       </w:pPr>
     </w:lvl>
   </w:abstractNum>
-  <w:abstractNum w:abstractNumId="9" w15:restartNumberingAfterBreak="0">
+  <w:abstractNum w:abstractNumId="10" w15:restartNumberingAfterBreak="0">
     <w:nsid w:val="59281D8D"/>
     <w:multiLevelType w:val="hybridMultilevel"/>
     <w:tmpl w:val="D1D694C6"/>
@@ -6120,7 +6420,7 @@
       </w:pPr>
     </w:lvl>
   </w:abstractNum>
-  <w:abstractNum w:abstractNumId="10" w15:restartNumberingAfterBreak="0">
+  <w:abstractNum w:abstractNumId="11" w15:restartNumberingAfterBreak="0">
     <w:nsid w:val="775B26AA"/>
     <w:multiLevelType w:val="hybridMultilevel"/>
     <w:tmpl w:val="055AD040"/>
@@ -6216,10 +6516,10 @@
     <w:abstractNumId w:val="6"/>
   </w:num>
   <w:num w:numId="4">
-    <w:abstractNumId w:val="10"/>
+    <w:abstractNumId w:val="11"/>
   </w:num>
   <w:num w:numId="5">
-    <w:abstractNumId w:val="9"/>
+    <w:abstractNumId w:val="10"/>
   </w:num>
   <w:num w:numId="6">
     <w:abstractNumId w:val="2"/>
@@ -6228,7 +6528,7 @@
     <w:abstractNumId w:val="1"/>
   </w:num>
   <w:num w:numId="8">
-    <w:abstractNumId w:val="8"/>
+    <w:abstractNumId w:val="9"/>
   </w:num>
   <w:num w:numId="9">
     <w:abstractNumId w:val="4"/>
@@ -6238,6 +6538,9 @@
   </w:num>
   <w:num w:numId="11">
     <w:abstractNumId w:val="5"/>
+  </w:num>
+  <w:num w:numId="12">
+    <w:abstractNumId w:val="8"/>
   </w:num>
 </w:numbering>
 </file>
@@ -6365,6 +6668,7 @@
     <w:lsdException w:name="HTML Sample" w:semiHidden="1" w:unhideWhenUsed="1"/>
     <w:lsdException w:name="HTML Typewriter" w:semiHidden="1" w:unhideWhenUsed="1"/>
     <w:lsdException w:name="HTML Variable" w:semiHidden="1" w:unhideWhenUsed="1"/>
+    <w:lsdException w:name="Normal Table" w:semiHidden="1" w:unhideWhenUsed="1"/>
     <w:lsdException w:name="annotation subject" w:semiHidden="1" w:unhideWhenUsed="1"/>
     <w:lsdException w:name="No List" w:semiHidden="1" w:unhideWhenUsed="1"/>
     <w:lsdException w:name="Outline List 1" w:semiHidden="1" w:unhideWhenUsed="1"/>
@@ -6407,8 +6711,11 @@
     <w:lsdException w:name="Table Contemporary" w:semiHidden="1" w:unhideWhenUsed="1"/>
     <w:lsdException w:name="Table Elegant" w:semiHidden="1" w:unhideWhenUsed="1"/>
     <w:lsdException w:name="Table Professional" w:semiHidden="1" w:unhideWhenUsed="1"/>
+    <w:lsdException w:name="Table Subtle 1" w:semiHidden="1" w:unhideWhenUsed="1"/>
     <w:lsdException w:name="Table Subtle 2" w:semiHidden="1" w:unhideWhenUsed="1"/>
     <w:lsdException w:name="Table Web 1" w:semiHidden="1" w:unhideWhenUsed="1"/>
+    <w:lsdException w:name="Table Web 2" w:semiHidden="1" w:unhideWhenUsed="1"/>
+    <w:lsdException w:name="Table Web 3" w:semiHidden="1" w:unhideWhenUsed="1"/>
     <w:lsdException w:name="Balloon Text" w:semiHidden="1" w:unhideWhenUsed="1"/>
     <w:lsdException w:name="Table Grid" w:uiPriority="39"/>
     <w:lsdException w:name="Table Theme" w:semiHidden="1" w:unhideWhenUsed="1"/>

</xml_diff>